<commit_message>
reran NMDS with new COAN seed mass
</commit_message>
<xml_diff>
--- a/outputs/total-indic-spp.docx
+++ b/outputs/total-indic-spp.docx
@@ -63,13 +63,17 @@
               <w:jc w:val="center"/>
               <w:rPr>
                 <w:rFonts w:ascii="Arial" w:hAnsi="Arial" w:cs="Arial"/>
-                <w:sz w:val="20"/>
-                <w:szCs w:val="20"/>
-              </w:rPr>
-            </w:pPr>
-            <w:r>
-              <w:rPr>
-                <w:rFonts w:ascii="Arial" w:hAnsi="Arial" w:cs="Arial"/>
+                <w:b/>
+                <w:bCs/>
+                <w:sz w:val="20"/>
+                <w:szCs w:val="20"/>
+              </w:rPr>
+            </w:pPr>
+            <w:r>
+              <w:rPr>
+                <w:rFonts w:ascii="Arial" w:hAnsi="Arial" w:cs="Arial"/>
+                <w:b/>
+                <w:bCs/>
                 <w:sz w:val="20"/>
                 <w:szCs w:val="20"/>
               </w:rPr>
@@ -89,13 +93,17 @@
               <w:jc w:val="center"/>
               <w:rPr>
                 <w:rFonts w:ascii="Arial" w:hAnsi="Arial" w:cs="Arial"/>
-                <w:sz w:val="20"/>
-                <w:szCs w:val="20"/>
-              </w:rPr>
-            </w:pPr>
-            <w:r>
-              <w:rPr>
-                <w:rFonts w:ascii="Arial" w:hAnsi="Arial" w:cs="Arial"/>
+                <w:b/>
+                <w:bCs/>
+                <w:sz w:val="20"/>
+                <w:szCs w:val="20"/>
+              </w:rPr>
+            </w:pPr>
+            <w:r>
+              <w:rPr>
+                <w:rFonts w:ascii="Arial" w:hAnsi="Arial" w:cs="Arial"/>
+                <w:b/>
+                <w:bCs/>
                 <w:sz w:val="20"/>
                 <w:szCs w:val="20"/>
               </w:rPr>
@@ -115,13 +123,17 @@
               <w:jc w:val="center"/>
               <w:rPr>
                 <w:rFonts w:ascii="Arial" w:hAnsi="Arial" w:cs="Arial"/>
-                <w:sz w:val="20"/>
-                <w:szCs w:val="20"/>
-              </w:rPr>
-            </w:pPr>
-            <w:r>
-              <w:rPr>
-                <w:rFonts w:ascii="Arial" w:hAnsi="Arial" w:cs="Arial"/>
+                <w:b/>
+                <w:bCs/>
+                <w:sz w:val="20"/>
+                <w:szCs w:val="20"/>
+              </w:rPr>
+            </w:pPr>
+            <w:r>
+              <w:rPr>
+                <w:rFonts w:ascii="Arial" w:hAnsi="Arial" w:cs="Arial"/>
+                <w:b/>
+                <w:bCs/>
                 <w:sz w:val="20"/>
                 <w:szCs w:val="20"/>
               </w:rPr>
@@ -140,13 +152,17 @@
               <w:jc w:val="center"/>
               <w:rPr>
                 <w:rFonts w:ascii="Arial" w:hAnsi="Arial" w:cs="Arial"/>
-                <w:sz w:val="20"/>
-                <w:szCs w:val="20"/>
-              </w:rPr>
-            </w:pPr>
-            <w:r>
-              <w:rPr>
-                <w:rFonts w:ascii="Arial" w:hAnsi="Arial" w:cs="Arial"/>
+                <w:b/>
+                <w:bCs/>
+                <w:sz w:val="20"/>
+                <w:szCs w:val="20"/>
+              </w:rPr>
+            </w:pPr>
+            <w:r>
+              <w:rPr>
+                <w:rFonts w:ascii="Arial" w:hAnsi="Arial" w:cs="Arial"/>
+                <w:b/>
+                <w:bCs/>
                 <w:sz w:val="20"/>
                 <w:szCs w:val="20"/>
               </w:rPr>
@@ -396,7 +412,15 @@
                 <w:sz w:val="20"/>
                 <w:szCs w:val="20"/>
               </w:rPr>
-              <w:t>MUVI</w:t>
+              <w:t>MU</w:t>
+            </w:r>
+            <w:r>
+              <w:rPr>
+                <w:rFonts w:ascii="Arial" w:hAnsi="Arial" w:cs="Arial"/>
+                <w:sz w:val="20"/>
+                <w:szCs w:val="20"/>
+              </w:rPr>
+              <w:t>ST</w:t>
             </w:r>
           </w:p>
         </w:tc>
@@ -1340,13 +1364,17 @@
               <w:jc w:val="center"/>
               <w:rPr>
                 <w:rFonts w:ascii="Arial" w:hAnsi="Arial" w:cs="Arial"/>
-                <w:sz w:val="20"/>
-                <w:szCs w:val="20"/>
-              </w:rPr>
-            </w:pPr>
-            <w:r>
-              <w:rPr>
-                <w:rFonts w:ascii="Arial" w:hAnsi="Arial" w:cs="Arial"/>
+                <w:b/>
+                <w:bCs/>
+                <w:sz w:val="20"/>
+                <w:szCs w:val="20"/>
+              </w:rPr>
+            </w:pPr>
+            <w:r>
+              <w:rPr>
+                <w:rFonts w:ascii="Arial" w:hAnsi="Arial" w:cs="Arial"/>
+                <w:b/>
+                <w:bCs/>
                 <w:sz w:val="20"/>
                 <w:szCs w:val="20"/>
               </w:rPr>
@@ -1366,13 +1394,17 @@
               <w:jc w:val="center"/>
               <w:rPr>
                 <w:rFonts w:ascii="Arial" w:hAnsi="Arial" w:cs="Arial"/>
-                <w:sz w:val="20"/>
-                <w:szCs w:val="20"/>
-              </w:rPr>
-            </w:pPr>
-            <w:r>
-              <w:rPr>
-                <w:rFonts w:ascii="Arial" w:hAnsi="Arial" w:cs="Arial"/>
+                <w:b/>
+                <w:bCs/>
+                <w:sz w:val="20"/>
+                <w:szCs w:val="20"/>
+              </w:rPr>
+            </w:pPr>
+            <w:r>
+              <w:rPr>
+                <w:rFonts w:ascii="Arial" w:hAnsi="Arial" w:cs="Arial"/>
+                <w:b/>
+                <w:bCs/>
                 <w:sz w:val="20"/>
                 <w:szCs w:val="20"/>
               </w:rPr>
@@ -1392,13 +1424,17 @@
               <w:jc w:val="center"/>
               <w:rPr>
                 <w:rFonts w:ascii="Arial" w:hAnsi="Arial" w:cs="Arial"/>
-                <w:sz w:val="20"/>
-                <w:szCs w:val="20"/>
-              </w:rPr>
-            </w:pPr>
-            <w:r>
-              <w:rPr>
-                <w:rFonts w:ascii="Arial" w:hAnsi="Arial" w:cs="Arial"/>
+                <w:b/>
+                <w:bCs/>
+                <w:sz w:val="20"/>
+                <w:szCs w:val="20"/>
+              </w:rPr>
+            </w:pPr>
+            <w:r>
+              <w:rPr>
+                <w:rFonts w:ascii="Arial" w:hAnsi="Arial" w:cs="Arial"/>
+                <w:b/>
+                <w:bCs/>
                 <w:sz w:val="20"/>
                 <w:szCs w:val="20"/>
               </w:rPr>
@@ -1417,13 +1453,17 @@
               <w:jc w:val="center"/>
               <w:rPr>
                 <w:rFonts w:ascii="Arial" w:hAnsi="Arial" w:cs="Arial"/>
-                <w:sz w:val="20"/>
-                <w:szCs w:val="20"/>
-              </w:rPr>
-            </w:pPr>
-            <w:r>
-              <w:rPr>
-                <w:rFonts w:ascii="Arial" w:hAnsi="Arial" w:cs="Arial"/>
+                <w:b/>
+                <w:bCs/>
+                <w:sz w:val="20"/>
+                <w:szCs w:val="20"/>
+              </w:rPr>
+            </w:pPr>
+            <w:r>
+              <w:rPr>
+                <w:rFonts w:ascii="Arial" w:hAnsi="Arial" w:cs="Arial"/>
+                <w:b/>
+                <w:bCs/>
                 <w:sz w:val="20"/>
                 <w:szCs w:val="20"/>
               </w:rPr>
@@ -2913,13 +2953,17 @@
               <w:jc w:val="center"/>
               <w:rPr>
                 <w:rFonts w:ascii="Arial" w:hAnsi="Arial" w:cs="Arial"/>
-                <w:sz w:val="20"/>
-                <w:szCs w:val="20"/>
-              </w:rPr>
-            </w:pPr>
-            <w:r>
-              <w:rPr>
-                <w:rFonts w:ascii="Arial" w:hAnsi="Arial" w:cs="Arial"/>
+                <w:b/>
+                <w:bCs/>
+                <w:sz w:val="20"/>
+                <w:szCs w:val="20"/>
+              </w:rPr>
+            </w:pPr>
+            <w:r>
+              <w:rPr>
+                <w:rFonts w:ascii="Arial" w:hAnsi="Arial" w:cs="Arial"/>
+                <w:b/>
+                <w:bCs/>
                 <w:sz w:val="20"/>
                 <w:szCs w:val="20"/>
               </w:rPr>
@@ -2939,13 +2983,17 @@
               <w:jc w:val="center"/>
               <w:rPr>
                 <w:rFonts w:ascii="Arial" w:hAnsi="Arial" w:cs="Arial"/>
-                <w:sz w:val="20"/>
-                <w:szCs w:val="20"/>
-              </w:rPr>
-            </w:pPr>
-            <w:r>
-              <w:rPr>
-                <w:rFonts w:ascii="Arial" w:hAnsi="Arial" w:cs="Arial"/>
+                <w:b/>
+                <w:bCs/>
+                <w:sz w:val="20"/>
+                <w:szCs w:val="20"/>
+              </w:rPr>
+            </w:pPr>
+            <w:r>
+              <w:rPr>
+                <w:rFonts w:ascii="Arial" w:hAnsi="Arial" w:cs="Arial"/>
+                <w:b/>
+                <w:bCs/>
                 <w:sz w:val="20"/>
                 <w:szCs w:val="20"/>
               </w:rPr>
@@ -2965,13 +3013,17 @@
               <w:jc w:val="center"/>
               <w:rPr>
                 <w:rFonts w:ascii="Arial" w:hAnsi="Arial" w:cs="Arial"/>
-                <w:sz w:val="20"/>
-                <w:szCs w:val="20"/>
-              </w:rPr>
-            </w:pPr>
-            <w:r>
-              <w:rPr>
-                <w:rFonts w:ascii="Arial" w:hAnsi="Arial" w:cs="Arial"/>
+                <w:b/>
+                <w:bCs/>
+                <w:sz w:val="20"/>
+                <w:szCs w:val="20"/>
+              </w:rPr>
+            </w:pPr>
+            <w:r>
+              <w:rPr>
+                <w:rFonts w:ascii="Arial" w:hAnsi="Arial" w:cs="Arial"/>
+                <w:b/>
+                <w:bCs/>
                 <w:sz w:val="20"/>
                 <w:szCs w:val="20"/>
               </w:rPr>
@@ -2990,13 +3042,17 @@
               <w:jc w:val="center"/>
               <w:rPr>
                 <w:rFonts w:ascii="Arial" w:hAnsi="Arial" w:cs="Arial"/>
-                <w:sz w:val="20"/>
-                <w:szCs w:val="20"/>
-              </w:rPr>
-            </w:pPr>
-            <w:r>
-              <w:rPr>
-                <w:rFonts w:ascii="Arial" w:hAnsi="Arial" w:cs="Arial"/>
+                <w:b/>
+                <w:bCs/>
+                <w:sz w:val="20"/>
+                <w:szCs w:val="20"/>
+              </w:rPr>
+            </w:pPr>
+            <w:r>
+              <w:rPr>
+                <w:rFonts w:ascii="Arial" w:hAnsi="Arial" w:cs="Arial"/>
+                <w:b/>
+                <w:bCs/>
                 <w:sz w:val="20"/>
                 <w:szCs w:val="20"/>
               </w:rPr>
@@ -4442,40 +4498,6 @@
           </w:tcPr>
           <w:p>
             <w:pPr>
-              <w:jc w:val="center"/>
-              <w:rPr>
-                <w:rFonts w:ascii="Arial" w:hAnsi="Arial" w:cs="Arial"/>
-                <w:sz w:val="20"/>
-                <w:szCs w:val="20"/>
-              </w:rPr>
-            </w:pPr>
-          </w:p>
-          <w:p>
-            <w:pPr>
-              <w:jc w:val="center"/>
-              <w:rPr>
-                <w:rFonts w:ascii="Arial" w:hAnsi="Arial" w:cs="Arial"/>
-                <w:sz w:val="20"/>
-                <w:szCs w:val="20"/>
-              </w:rPr>
-            </w:pPr>
-          </w:p>
-        </w:tc>
-      </w:tr>
-      <w:tr>
-        <w:trPr>
-          <w:trHeight w:val="320"/>
-        </w:trPr>
-        <w:tc>
-          <w:tcPr>
-            <w:tcW w:w="9350" w:type="dxa"/>
-            <w:gridSpan w:val="4"/>
-            <w:noWrap/>
-            <w:vAlign w:val="center"/>
-            <w:hideMark/>
-          </w:tcPr>
-          <w:p>
-            <w:pPr>
               <w:rPr>
                 <w:rFonts w:ascii="Arial" w:hAnsi="Arial" w:cs="Arial"/>
                 <w:sz w:val="20"/>
@@ -4511,13 +4533,17 @@
               <w:jc w:val="center"/>
               <w:rPr>
                 <w:rFonts w:ascii="Arial" w:hAnsi="Arial" w:cs="Arial"/>
-                <w:sz w:val="20"/>
-                <w:szCs w:val="20"/>
-              </w:rPr>
-            </w:pPr>
-            <w:r>
-              <w:rPr>
-                <w:rFonts w:ascii="Arial" w:hAnsi="Arial" w:cs="Arial"/>
+                <w:b/>
+                <w:bCs/>
+                <w:sz w:val="20"/>
+                <w:szCs w:val="20"/>
+              </w:rPr>
+            </w:pPr>
+            <w:r>
+              <w:rPr>
+                <w:rFonts w:ascii="Arial" w:hAnsi="Arial" w:cs="Arial"/>
+                <w:b/>
+                <w:bCs/>
                 <w:sz w:val="20"/>
                 <w:szCs w:val="20"/>
               </w:rPr>
@@ -4537,13 +4563,17 @@
               <w:jc w:val="center"/>
               <w:rPr>
                 <w:rFonts w:ascii="Arial" w:hAnsi="Arial" w:cs="Arial"/>
-                <w:sz w:val="20"/>
-                <w:szCs w:val="20"/>
-              </w:rPr>
-            </w:pPr>
-            <w:r>
-              <w:rPr>
-                <w:rFonts w:ascii="Arial" w:hAnsi="Arial" w:cs="Arial"/>
+                <w:b/>
+                <w:bCs/>
+                <w:sz w:val="20"/>
+                <w:szCs w:val="20"/>
+              </w:rPr>
+            </w:pPr>
+            <w:r>
+              <w:rPr>
+                <w:rFonts w:ascii="Arial" w:hAnsi="Arial" w:cs="Arial"/>
+                <w:b/>
+                <w:bCs/>
                 <w:sz w:val="20"/>
                 <w:szCs w:val="20"/>
               </w:rPr>
@@ -4563,13 +4593,17 @@
               <w:jc w:val="center"/>
               <w:rPr>
                 <w:rFonts w:ascii="Arial" w:hAnsi="Arial" w:cs="Arial"/>
-                <w:sz w:val="20"/>
-                <w:szCs w:val="20"/>
-              </w:rPr>
-            </w:pPr>
-            <w:r>
-              <w:rPr>
-                <w:rFonts w:ascii="Arial" w:hAnsi="Arial" w:cs="Arial"/>
+                <w:b/>
+                <w:bCs/>
+                <w:sz w:val="20"/>
+                <w:szCs w:val="20"/>
+              </w:rPr>
+            </w:pPr>
+            <w:r>
+              <w:rPr>
+                <w:rFonts w:ascii="Arial" w:hAnsi="Arial" w:cs="Arial"/>
+                <w:b/>
+                <w:bCs/>
                 <w:sz w:val="20"/>
                 <w:szCs w:val="20"/>
               </w:rPr>
@@ -4588,13 +4622,17 @@
               <w:jc w:val="center"/>
               <w:rPr>
                 <w:rFonts w:ascii="Arial" w:hAnsi="Arial" w:cs="Arial"/>
-                <w:sz w:val="20"/>
-                <w:szCs w:val="20"/>
-              </w:rPr>
-            </w:pPr>
-            <w:r>
-              <w:rPr>
-                <w:rFonts w:ascii="Arial" w:hAnsi="Arial" w:cs="Arial"/>
+                <w:b/>
+                <w:bCs/>
+                <w:sz w:val="20"/>
+                <w:szCs w:val="20"/>
+              </w:rPr>
+            </w:pPr>
+            <w:r>
+              <w:rPr>
+                <w:rFonts w:ascii="Arial" w:hAnsi="Arial" w:cs="Arial"/>
+                <w:b/>
+                <w:bCs/>
                 <w:sz w:val="20"/>
                 <w:szCs w:val="20"/>
               </w:rPr>
@@ -5944,40 +5982,6 @@
           </w:tcPr>
           <w:p>
             <w:pPr>
-              <w:jc w:val="center"/>
-              <w:rPr>
-                <w:rFonts w:ascii="Arial" w:hAnsi="Arial" w:cs="Arial"/>
-                <w:sz w:val="20"/>
-                <w:szCs w:val="20"/>
-              </w:rPr>
-            </w:pPr>
-          </w:p>
-          <w:p>
-            <w:pPr>
-              <w:jc w:val="center"/>
-              <w:rPr>
-                <w:rFonts w:ascii="Arial" w:hAnsi="Arial" w:cs="Arial"/>
-                <w:sz w:val="20"/>
-                <w:szCs w:val="20"/>
-              </w:rPr>
-            </w:pPr>
-          </w:p>
-        </w:tc>
-      </w:tr>
-      <w:tr>
-        <w:trPr>
-          <w:trHeight w:val="320"/>
-        </w:trPr>
-        <w:tc>
-          <w:tcPr>
-            <w:tcW w:w="9350" w:type="dxa"/>
-            <w:gridSpan w:val="4"/>
-            <w:noWrap/>
-            <w:vAlign w:val="center"/>
-            <w:hideMark/>
-          </w:tcPr>
-          <w:p>
-            <w:pPr>
               <w:rPr>
                 <w:rFonts w:ascii="Arial" w:hAnsi="Arial" w:cs="Arial"/>
                 <w:sz w:val="20"/>
@@ -6013,13 +6017,17 @@
               <w:jc w:val="center"/>
               <w:rPr>
                 <w:rFonts w:ascii="Arial" w:hAnsi="Arial" w:cs="Arial"/>
-                <w:sz w:val="20"/>
-                <w:szCs w:val="20"/>
-              </w:rPr>
-            </w:pPr>
-            <w:r>
-              <w:rPr>
-                <w:rFonts w:ascii="Arial" w:hAnsi="Arial" w:cs="Arial"/>
+                <w:b/>
+                <w:bCs/>
+                <w:sz w:val="20"/>
+                <w:szCs w:val="20"/>
+              </w:rPr>
+            </w:pPr>
+            <w:r>
+              <w:rPr>
+                <w:rFonts w:ascii="Arial" w:hAnsi="Arial" w:cs="Arial"/>
+                <w:b/>
+                <w:bCs/>
                 <w:sz w:val="20"/>
                 <w:szCs w:val="20"/>
               </w:rPr>
@@ -6039,13 +6047,17 @@
               <w:jc w:val="center"/>
               <w:rPr>
                 <w:rFonts w:ascii="Arial" w:hAnsi="Arial" w:cs="Arial"/>
-                <w:sz w:val="20"/>
-                <w:szCs w:val="20"/>
-              </w:rPr>
-            </w:pPr>
-            <w:r>
-              <w:rPr>
-                <w:rFonts w:ascii="Arial" w:hAnsi="Arial" w:cs="Arial"/>
+                <w:b/>
+                <w:bCs/>
+                <w:sz w:val="20"/>
+                <w:szCs w:val="20"/>
+              </w:rPr>
+            </w:pPr>
+            <w:r>
+              <w:rPr>
+                <w:rFonts w:ascii="Arial" w:hAnsi="Arial" w:cs="Arial"/>
+                <w:b/>
+                <w:bCs/>
                 <w:sz w:val="20"/>
                 <w:szCs w:val="20"/>
               </w:rPr>
@@ -6065,13 +6077,17 @@
               <w:jc w:val="center"/>
               <w:rPr>
                 <w:rFonts w:ascii="Arial" w:hAnsi="Arial" w:cs="Arial"/>
-                <w:sz w:val="20"/>
-                <w:szCs w:val="20"/>
-              </w:rPr>
-            </w:pPr>
-            <w:r>
-              <w:rPr>
-                <w:rFonts w:ascii="Arial" w:hAnsi="Arial" w:cs="Arial"/>
+                <w:b/>
+                <w:bCs/>
+                <w:sz w:val="20"/>
+                <w:szCs w:val="20"/>
+              </w:rPr>
+            </w:pPr>
+            <w:r>
+              <w:rPr>
+                <w:rFonts w:ascii="Arial" w:hAnsi="Arial" w:cs="Arial"/>
+                <w:b/>
+                <w:bCs/>
                 <w:sz w:val="20"/>
                 <w:szCs w:val="20"/>
               </w:rPr>
@@ -6090,13 +6106,17 @@
               <w:jc w:val="center"/>
               <w:rPr>
                 <w:rFonts w:ascii="Arial" w:hAnsi="Arial" w:cs="Arial"/>
-                <w:sz w:val="20"/>
-                <w:szCs w:val="20"/>
-              </w:rPr>
-            </w:pPr>
-            <w:r>
-              <w:rPr>
-                <w:rFonts w:ascii="Arial" w:hAnsi="Arial" w:cs="Arial"/>
+                <w:b/>
+                <w:bCs/>
+                <w:sz w:val="20"/>
+                <w:szCs w:val="20"/>
+              </w:rPr>
+            </w:pPr>
+            <w:r>
+              <w:rPr>
+                <w:rFonts w:ascii="Arial" w:hAnsi="Arial" w:cs="Arial"/>
+                <w:b/>
+                <w:bCs/>
                 <w:sz w:val="20"/>
                 <w:szCs w:val="20"/>
               </w:rPr>
@@ -7431,6 +7451,7 @@
   <w:style w:type="character" w:default="1" w:styleId="DefaultParagraphFont">
     <w:name w:val="Default Paragraph Font"/>
     <w:uiPriority w:val="1"/>
+    <w:semiHidden/>
     <w:unhideWhenUsed/>
   </w:style>
   <w:style w:type="table" w:default="1" w:styleId="TableNormal">

</xml_diff>